<commit_message>
nmv 05 06 2026
</commit_message>
<xml_diff>
--- a/TS-Padam/TS-1.1/TS 1.1 Malayalam Pada Paatam Corrections.docx
+++ b/TS-Padam/TS-1.1/TS 1.1 Malayalam Pada Paatam Corrections.docx
@@ -2,976 +2,6 @@
 <file path=word/document.xml><?xml version="1.0" encoding="utf-8"?>
 <w:document xmlns:wpc="http://schemas.microsoft.com/office/word/2010/wordprocessingCanvas" xmlns:cx="http://schemas.microsoft.com/office/drawing/2014/chartex" xmlns:cx1="http://schemas.microsoft.com/office/drawing/2015/9/8/chartex" xmlns:cx2="http://schemas.microsoft.com/office/drawing/2015/10/21/chartex" xmlns:cx3="http://schemas.microsoft.com/office/drawing/2016/5/9/chartex" xmlns:cx4="http://schemas.microsoft.com/office/drawing/2016/5/10/chartex" xmlns:cx5="http://schemas.microsoft.com/office/drawing/2016/5/11/chartex" xmlns:cx6="http://schemas.microsoft.com/office/drawing/2016/5/12/chartex" xmlns:cx7="http://schemas.microsoft.com/office/drawing/2016/5/13/chartex" xmlns:cx8="http://schemas.microsoft.com/office/drawing/2016/5/14/chartex" xmlns:mc="http://schemas.openxmlformats.org/markup-compatibility/2006" xmlns:aink="http://schemas.microsoft.com/office/drawing/2016/ink" xmlns:am3d="http://schemas.microsoft.com/office/drawing/2017/model3d" xmlns:o="urn:schemas-microsoft-com:office:office" xmlns:oel="http://schemas.microsoft.com/office/2019/extlst" xmlns:r="http://schemas.openxmlformats.org/officeDocument/2006/relationships" xmlns:m="http://schemas.openxmlformats.org/officeDocument/2006/math" xmlns:v="urn:schemas-microsoft-com:vml" xmlns:wp14="http://schemas.microsoft.com/office/word/2010/wordprocessingDrawing" xmlns:wp="http://schemas.openxmlformats.org/drawingml/2006/wordprocessingDrawing" xmlns:w10="urn:schemas-microsoft-com:office:word" xmlns:w="http://schemas.openxmlformats.org/wordprocessingml/2006/main" xmlns:w14="http://schemas.microsoft.com/office/word/2010/wordml" xmlns:w15="http://schemas.microsoft.com/office/word/2012/wordml" xmlns:w16cex="http://schemas.microsoft.com/office/word/2018/wordml/cex" xmlns:w16cid="http://schemas.microsoft.com/office/word/2016/wordml/cid" xmlns:w16="http://schemas.microsoft.com/office/word/2018/wordml" xmlns:w16du="http://schemas.microsoft.com/office/word/2023/wordml/word16du" xmlns:w16sdtdh="http://schemas.microsoft.com/office/word/2020/wordml/sdtdatahash" xmlns:w16sdtfl="http://schemas.microsoft.com/office/word/2024/wordml/sdtformatlock" xmlns:w16se="http://schemas.microsoft.com/office/word/2015/wordml/symex" xmlns:wpg="http://schemas.microsoft.com/office/word/2010/wordprocessingGroup" xmlns:wpi="http://schemas.microsoft.com/office/word/2010/wordprocessingInk" xmlns:wne="http://schemas.microsoft.com/office/word/2006/wordml" xmlns:wps="http://schemas.microsoft.com/office/word/2010/wordprocessingShape" mc:Ignorable="w14 w15 w16se w16cid w16 w16cex w16sdtdh w16sdtfl w16du wp14">
   <w:body>
-    <w:p>
-      <w:pPr>
-        <w:jc w:val="center"/>
-        <w:rPr>
-          <w:b/>
-          <w:bCs/>
-          <w:sz w:val="32"/>
-          <w:szCs w:val="32"/>
-          <w:u w:val="single"/>
-        </w:rPr>
-      </w:pPr>
-      <w:r>
-        <w:rPr>
-          <w:b/>
-          <w:bCs/>
-          <w:sz w:val="32"/>
-          <w:szCs w:val="32"/>
-          <w:u w:val="single"/>
-        </w:rPr>
-        <w:t xml:space="preserve">TS Pada Paatam – TS 1.1 </w:t>
-      </w:r>
-      <w:r>
-        <w:rPr>
-          <w:b/>
-          <w:bCs/>
-          <w:sz w:val="32"/>
-          <w:szCs w:val="32"/>
-          <w:u w:val="single"/>
-        </w:rPr>
-        <w:t>Malayalam</w:t>
-      </w:r>
-      <w:r>
-        <w:rPr>
-          <w:b/>
-          <w:bCs/>
-          <w:sz w:val="32"/>
-          <w:szCs w:val="32"/>
-          <w:u w:val="single"/>
-        </w:rPr>
-        <w:t xml:space="preserve"> Corrections –</w:t>
-      </w:r>
-      <w:r>
-        <w:rPr>
-          <w:b/>
-          <w:bCs/>
-          <w:sz w:val="32"/>
-          <w:szCs w:val="32"/>
-          <w:u w:val="single"/>
-        </w:rPr>
-        <w:t xml:space="preserve"> </w:t>
-      </w:r>
-      <w:r>
-        <w:rPr>
-          <w:b/>
-          <w:bCs/>
-          <w:sz w:val="32"/>
-          <w:szCs w:val="32"/>
-          <w:u w:val="single"/>
-        </w:rPr>
-        <w:t xml:space="preserve">Observed till </w:t>
-      </w:r>
-      <w:r>
-        <w:rPr>
-          <w:b/>
-          <w:bCs/>
-          <w:sz w:val="32"/>
-          <w:szCs w:val="32"/>
-          <w:highlight w:val="red"/>
-          <w:u w:val="single"/>
-        </w:rPr>
-        <w:t>?????</w:t>
-      </w:r>
-    </w:p>
-    <w:p>
-      <w:pPr>
-        <w:spacing w:before="0" w:line="240" w:lineRule="auto"/>
-        <w:jc w:val="center"/>
-        <w:rPr>
-          <w:bCs/>
-          <w:sz w:val="32"/>
-          <w:szCs w:val="32"/>
-        </w:rPr>
-      </w:pPr>
-      <w:r>
-        <w:rPr>
-          <w:bCs/>
-          <w:sz w:val="32"/>
-          <w:szCs w:val="32"/>
-        </w:rPr>
-        <w:t>(ignore those which are already incorporated in your book’s version and date)</w:t>
-      </w:r>
-    </w:p>
-    <w:tbl>
-      <w:tblPr>
-        <w:tblW w:w="13353" w:type="dxa"/>
-        <w:tblInd w:w="250" w:type="dxa"/>
-        <w:tblBorders>
-          <w:top w:val="single" w:sz="4" w:space="0" w:color="000000"/>
-          <w:left w:val="single" w:sz="4" w:space="0" w:color="000000"/>
-          <w:bottom w:val="single" w:sz="4" w:space="0" w:color="000000"/>
-          <w:right w:val="single" w:sz="4" w:space="0" w:color="000000"/>
-          <w:insideH w:val="single" w:sz="4" w:space="0" w:color="000000"/>
-          <w:insideV w:val="single" w:sz="4" w:space="0" w:color="000000"/>
-        </w:tblBorders>
-        <w:tblLook w:val="04A0" w:firstRow="1" w:lastRow="0" w:firstColumn="1" w:lastColumn="0" w:noHBand="0" w:noVBand="1"/>
-      </w:tblPr>
-      <w:tblGrid>
-        <w:gridCol w:w="3006"/>
-        <w:gridCol w:w="5244"/>
-        <w:gridCol w:w="5103"/>
-      </w:tblGrid>
-      <w:tr>
-        <w:tc>
-          <w:tcPr>
-            <w:tcW w:w="3006" w:type="dxa"/>
-          </w:tcPr>
-          <w:p>
-            <w:pPr>
-              <w:spacing w:before="0" w:line="240" w:lineRule="auto"/>
-              <w:jc w:val="center"/>
-              <w:rPr>
-                <w:sz w:val="32"/>
-                <w:szCs w:val="32"/>
-              </w:rPr>
-            </w:pPr>
-            <w:r>
-              <w:rPr>
-                <w:sz w:val="32"/>
-                <w:szCs w:val="32"/>
-              </w:rPr>
-              <w:t>Section, Paragraph</w:t>
-            </w:r>
-          </w:p>
-          <w:p>
-            <w:pPr>
-              <w:spacing w:before="0" w:line="240" w:lineRule="auto"/>
-              <w:jc w:val="center"/>
-              <w:rPr>
-                <w:sz w:val="32"/>
-                <w:szCs w:val="32"/>
-              </w:rPr>
-            </w:pPr>
-            <w:r>
-              <w:rPr>
-                <w:sz w:val="32"/>
-                <w:szCs w:val="32"/>
-              </w:rPr>
-              <w:t>Reference</w:t>
-            </w:r>
-          </w:p>
-        </w:tc>
-        <w:tc>
-          <w:tcPr>
-            <w:tcW w:w="5244" w:type="dxa"/>
-          </w:tcPr>
-          <w:p>
-            <w:pPr>
-              <w:spacing w:before="0" w:line="240" w:lineRule="auto"/>
-              <w:jc w:val="center"/>
-              <w:rPr>
-                <w:sz w:val="32"/>
-                <w:szCs w:val="32"/>
-              </w:rPr>
-            </w:pPr>
-            <w:r>
-              <w:rPr>
-                <w:sz w:val="32"/>
-                <w:szCs w:val="32"/>
-              </w:rPr>
-              <w:t>As Printed</w:t>
-            </w:r>
-          </w:p>
-        </w:tc>
-        <w:tc>
-          <w:tcPr>
-            <w:tcW w:w="5103" w:type="dxa"/>
-          </w:tcPr>
-          <w:p>
-            <w:pPr>
-              <w:spacing w:before="0" w:line="240" w:lineRule="auto"/>
-              <w:ind w:left="-183" w:right="-18"/>
-              <w:jc w:val="center"/>
-              <w:rPr>
-                <w:sz w:val="32"/>
-                <w:szCs w:val="32"/>
-              </w:rPr>
-            </w:pPr>
-            <w:r>
-              <w:rPr>
-                <w:sz w:val="32"/>
-                <w:szCs w:val="32"/>
-              </w:rPr>
-              <w:t>To be read as or corrected as</w:t>
-            </w:r>
-          </w:p>
-        </w:tc>
-      </w:tr>
-      <w:tr>
-        <w:trPr>
-          <w:trHeight w:val="1161"/>
-        </w:trPr>
-        <w:tc>
-          <w:tcPr>
-            <w:tcW w:w="3006" w:type="dxa"/>
-            <w:tcBorders>
-              <w:top w:val="single" w:sz="4" w:space="0" w:color="000000"/>
-              <w:left w:val="single" w:sz="4" w:space="0" w:color="000000"/>
-              <w:bottom w:val="single" w:sz="4" w:space="0" w:color="auto"/>
-              <w:right w:val="single" w:sz="4" w:space="0" w:color="000000"/>
-            </w:tcBorders>
-          </w:tcPr>
-          <w:p>
-            <w:pPr>
-              <w:spacing w:before="0" w:line="240" w:lineRule="auto"/>
-              <w:ind w:left="29"/>
-              <w:rPr>
-                <w:rFonts w:cs="Arial"/>
-                <w:b/>
-                <w:color w:val="000000"/>
-                <w:sz w:val="32"/>
-                <w:szCs w:val="32"/>
-                <w:lang w:val="it-IT"/>
-              </w:rPr>
-            </w:pPr>
-            <w:r>
-              <w:rPr>
-                <w:rFonts w:cs="Arial"/>
-                <w:b/>
-                <w:color w:val="000000"/>
-                <w:sz w:val="32"/>
-                <w:szCs w:val="32"/>
-                <w:lang w:val="it-IT"/>
-              </w:rPr>
-              <w:t>1.1.</w:t>
-            </w:r>
-            <w:r>
-              <w:rPr>
-                <w:rFonts w:cs="Arial"/>
-                <w:b/>
-                <w:color w:val="000000"/>
-                <w:sz w:val="32"/>
-                <w:szCs w:val="32"/>
-                <w:lang w:val="it-IT"/>
-              </w:rPr>
-              <w:t>9.3</w:t>
-            </w:r>
-            <w:r>
-              <w:rPr>
-                <w:rFonts w:cs="Arial"/>
-                <w:b/>
-                <w:color w:val="000000"/>
-                <w:sz w:val="32"/>
-                <w:szCs w:val="32"/>
-                <w:lang w:val="it-IT"/>
-              </w:rPr>
-              <w:t xml:space="preserve"> – Padam</w:t>
-            </w:r>
-          </w:p>
-          <w:p>
-            <w:pPr>
-              <w:spacing w:before="0" w:line="240" w:lineRule="auto"/>
-              <w:ind w:left="29"/>
-              <w:rPr>
-                <w:rFonts w:cs="Arial"/>
-                <w:b/>
-                <w:color w:val="000000"/>
-                <w:sz w:val="32"/>
-                <w:szCs w:val="32"/>
-                <w:lang w:val="it-IT"/>
-              </w:rPr>
-            </w:pPr>
-            <w:r>
-              <w:rPr>
-                <w:rFonts w:cs="Arial"/>
-                <w:b/>
-                <w:color w:val="000000"/>
-                <w:sz w:val="32"/>
-                <w:szCs w:val="32"/>
-                <w:lang w:val="it-IT"/>
-              </w:rPr>
-              <w:t xml:space="preserve">Padam No.- </w:t>
-            </w:r>
-            <w:r>
-              <w:rPr>
-                <w:rFonts w:cs="Arial"/>
-                <w:b/>
-                <w:color w:val="000000"/>
-                <w:sz w:val="32"/>
-                <w:szCs w:val="32"/>
-                <w:lang w:val="it-IT"/>
-              </w:rPr>
-              <w:t>43</w:t>
-            </w:r>
-          </w:p>
-          <w:p>
-            <w:pPr>
-              <w:spacing w:before="0" w:line="240" w:lineRule="auto"/>
-              <w:ind w:left="29"/>
-              <w:rPr>
-                <w:rFonts w:cs="Arial"/>
-                <w:b/>
-                <w:color w:val="000000"/>
-                <w:sz w:val="32"/>
-                <w:szCs w:val="32"/>
-                <w:lang w:val="it-IT"/>
-              </w:rPr>
-            </w:pPr>
-            <w:r>
-              <w:rPr>
-                <w:rFonts w:cs="Arial"/>
-                <w:b/>
-                <w:color w:val="000000"/>
-                <w:sz w:val="32"/>
-                <w:szCs w:val="32"/>
-                <w:lang w:val="it-IT"/>
-              </w:rPr>
-              <w:t xml:space="preserve">Panchaati No. - </w:t>
-            </w:r>
-            <w:r>
-              <w:rPr>
-                <w:rFonts w:cs="Arial"/>
-                <w:b/>
-                <w:color w:val="000000"/>
-                <w:sz w:val="32"/>
-                <w:szCs w:val="32"/>
-                <w:lang w:val="it-IT"/>
-              </w:rPr>
-              <w:t>15</w:t>
-            </w:r>
-          </w:p>
-        </w:tc>
-        <w:tc>
-          <w:tcPr>
-            <w:tcW w:w="5244" w:type="dxa"/>
-            <w:tcBorders>
-              <w:top w:val="single" w:sz="4" w:space="0" w:color="000000"/>
-              <w:left w:val="single" w:sz="4" w:space="0" w:color="000000"/>
-              <w:bottom w:val="single" w:sz="4" w:space="0" w:color="auto"/>
-              <w:right w:val="single" w:sz="4" w:space="0" w:color="000000"/>
-            </w:tcBorders>
-          </w:tcPr>
-          <w:p>
-            <w:pPr>
-              <w:widowControl w:val="0"/>
-              <w:autoSpaceDE w:val="0"/>
-              <w:autoSpaceDN w:val="0"/>
-              <w:adjustRightInd w:val="0"/>
-              <w:spacing w:before="0" w:line="240" w:lineRule="auto"/>
-              <w:ind w:right="-136"/>
-              <w:rPr>
-                <w:rFonts w:ascii="BRH Malayalam Extra" w:hAnsi="BRH Malayalam Extra" w:cs="BRH Malayalam Extra"/>
-                <w:sz w:val="40"/>
-                <w:szCs w:val="40"/>
-                <w:lang w:val="en-IN" w:eastAsia="en-IN"/>
-              </w:rPr>
-            </w:pPr>
-            <w:r>
-              <w:rPr>
-                <w:rFonts w:ascii="BRH Malayalam Extra" w:hAnsi="BRH Malayalam Extra" w:cs="BRH Malayalam Extra"/>
-                <w:sz w:val="40"/>
-                <w:szCs w:val="40"/>
-                <w:lang w:val="en-IN" w:eastAsia="en-IN"/>
-              </w:rPr>
-              <w:t>D</w:t>
-            </w:r>
-            <w:r>
-              <w:rPr>
-                <w:rFonts w:ascii="BRH Malayalam Extra" w:hAnsi="BRH Malayalam Extra" w:cs="BRH Malayalam Extra"/>
-                <w:sz w:val="32"/>
-                <w:szCs w:val="40"/>
-                <w:lang w:val="en-IN" w:eastAsia="en-IN"/>
-              </w:rPr>
-              <w:t>–</w:t>
-            </w:r>
-            <w:r>
-              <w:rPr>
-                <w:rFonts w:ascii="BRH Malayalam Extra" w:hAnsi="BRH Malayalam Extra" w:cs="BRH Malayalam Extra"/>
-                <w:sz w:val="40"/>
-                <w:szCs w:val="40"/>
-                <w:lang w:val="en-IN" w:eastAsia="en-IN"/>
-              </w:rPr>
-              <w:t>ªpz | P</w:t>
-            </w:r>
-            <w:r>
-              <w:rPr>
-                <w:rFonts w:ascii="BRH Malayalam Extra" w:hAnsi="BRH Malayalam Extra" w:cs="BRH Malayalam Extra"/>
-                <w:sz w:val="32"/>
-                <w:szCs w:val="40"/>
-                <w:lang w:val="en-IN" w:eastAsia="en-IN"/>
-              </w:rPr>
-              <w:t>–</w:t>
-            </w:r>
-            <w:r>
-              <w:rPr>
-                <w:rFonts w:ascii="BRH Malayalam Extra" w:hAnsi="BRH Malayalam Extra" w:cs="BRH Malayalam Extra"/>
-                <w:sz w:val="40"/>
-                <w:szCs w:val="40"/>
-                <w:lang w:val="en-IN" w:eastAsia="en-IN"/>
-              </w:rPr>
-              <w:t xml:space="preserve"> | </w:t>
-            </w:r>
-            <w:r>
-              <w:rPr>
-                <w:rFonts w:ascii="BRH Malayalam Extra" w:hAnsi="BRH Malayalam Extra" w:cs="BRH Malayalam Extra"/>
-                <w:sz w:val="40"/>
-                <w:szCs w:val="40"/>
-                <w:highlight w:val="yellow"/>
-                <w:lang w:val="en-IN" w:eastAsia="en-IN"/>
-              </w:rPr>
-              <w:t>A</w:t>
-            </w:r>
-            <w:r>
-              <w:rPr>
-                <w:rFonts w:ascii="BRH Malayalam Extra" w:hAnsi="BRH Malayalam Extra" w:cs="BRH Malayalam Extra"/>
-                <w:sz w:val="32"/>
-                <w:szCs w:val="40"/>
-                <w:highlight w:val="yellow"/>
-                <w:lang w:val="en-IN" w:eastAsia="en-IN"/>
-              </w:rPr>
-              <w:t>–</w:t>
-            </w:r>
-            <w:r>
-              <w:rPr>
-                <w:rFonts w:ascii="BRH Malayalam Extra" w:hAnsi="BRH Malayalam Extra" w:cs="BRH Malayalam Extra"/>
-                <w:sz w:val="40"/>
-                <w:szCs w:val="40"/>
-                <w:highlight w:val="yellow"/>
-                <w:lang w:val="en-IN" w:eastAsia="en-IN"/>
-              </w:rPr>
-              <w:t>sy</w:t>
-            </w:r>
-            <w:r>
-              <w:rPr>
-                <w:rFonts w:ascii="BRH Malayalam Extra" w:hAnsi="BRH Malayalam Extra" w:cs="BRH Malayalam Extra"/>
-                <w:sz w:val="32"/>
-                <w:szCs w:val="40"/>
-                <w:lang w:val="en-IN" w:eastAsia="en-IN"/>
-              </w:rPr>
-              <w:t>–</w:t>
-            </w:r>
-            <w:r>
-              <w:rPr>
-                <w:rFonts w:ascii="BRH Malayalam Extra" w:hAnsi="BRH Malayalam Extra" w:cs="BRH Malayalam Extra"/>
-                <w:sz w:val="40"/>
-                <w:szCs w:val="40"/>
-                <w:lang w:val="en-IN" w:eastAsia="en-IN"/>
-              </w:rPr>
-              <w:t xml:space="preserve"> |</w:t>
-            </w:r>
-          </w:p>
-        </w:tc>
-        <w:tc>
-          <w:tcPr>
-            <w:tcW w:w="5103" w:type="dxa"/>
-            <w:tcBorders>
-              <w:top w:val="single" w:sz="4" w:space="0" w:color="000000"/>
-              <w:left w:val="single" w:sz="4" w:space="0" w:color="000000"/>
-              <w:bottom w:val="single" w:sz="4" w:space="0" w:color="auto"/>
-              <w:right w:val="single" w:sz="4" w:space="0" w:color="000000"/>
-            </w:tcBorders>
-          </w:tcPr>
-          <w:p>
-            <w:pPr>
-              <w:widowControl w:val="0"/>
-              <w:autoSpaceDE w:val="0"/>
-              <w:autoSpaceDN w:val="0"/>
-              <w:adjustRightInd w:val="0"/>
-              <w:spacing w:before="0" w:line="240" w:lineRule="auto"/>
-              <w:ind w:right="-136"/>
-              <w:rPr>
-                <w:rFonts w:ascii="BRH Malayalam Extra" w:hAnsi="BRH Malayalam Extra" w:cs="BRH Malayalam Extra"/>
-                <w:sz w:val="40"/>
-                <w:szCs w:val="40"/>
-                <w:lang w:val="en-IN" w:eastAsia="en-IN"/>
-              </w:rPr>
-            </w:pPr>
-            <w:r>
-              <w:rPr>
-                <w:rFonts w:ascii="BRH Malayalam Extra" w:hAnsi="BRH Malayalam Extra" w:cs="BRH Malayalam Extra"/>
-                <w:sz w:val="40"/>
-                <w:szCs w:val="40"/>
-                <w:lang w:val="en-IN" w:eastAsia="en-IN"/>
-              </w:rPr>
-              <w:t>D</w:t>
-            </w:r>
-            <w:r>
-              <w:rPr>
-                <w:rFonts w:ascii="BRH Malayalam Extra" w:hAnsi="BRH Malayalam Extra" w:cs="BRH Malayalam Extra"/>
-                <w:sz w:val="32"/>
-                <w:szCs w:val="40"/>
-                <w:lang w:val="en-IN" w:eastAsia="en-IN"/>
-              </w:rPr>
-              <w:t>–</w:t>
-            </w:r>
-            <w:r>
-              <w:rPr>
-                <w:rFonts w:ascii="BRH Malayalam Extra" w:hAnsi="BRH Malayalam Extra" w:cs="BRH Malayalam Extra"/>
-                <w:sz w:val="40"/>
-                <w:szCs w:val="40"/>
-                <w:lang w:val="en-IN" w:eastAsia="en-IN"/>
-              </w:rPr>
-              <w:t>ªpz | P</w:t>
-            </w:r>
-            <w:r>
-              <w:rPr>
-                <w:rFonts w:ascii="BRH Malayalam Extra" w:hAnsi="BRH Malayalam Extra" w:cs="BRH Malayalam Extra"/>
-                <w:sz w:val="32"/>
-                <w:szCs w:val="40"/>
-                <w:lang w:val="en-IN" w:eastAsia="en-IN"/>
-              </w:rPr>
-              <w:t>–</w:t>
-            </w:r>
-            <w:r>
-              <w:rPr>
-                <w:rFonts w:ascii="BRH Malayalam Extra" w:hAnsi="BRH Malayalam Extra" w:cs="BRH Malayalam Extra"/>
-                <w:sz w:val="40"/>
-                <w:szCs w:val="40"/>
-                <w:lang w:val="en-IN" w:eastAsia="en-IN"/>
-              </w:rPr>
-              <w:t xml:space="preserve"> | </w:t>
-            </w:r>
-            <w:r>
-              <w:rPr>
-                <w:rFonts w:ascii="BRH Malayalam Extra" w:hAnsi="BRH Malayalam Extra" w:cs="BRH Malayalam Extra"/>
-                <w:sz w:val="40"/>
-                <w:szCs w:val="40"/>
-                <w:highlight w:val="green"/>
-                <w:lang w:val="en-IN" w:eastAsia="en-IN"/>
-              </w:rPr>
-              <w:t>Asy</w:t>
-            </w:r>
-            <w:r>
-              <w:rPr>
-                <w:rFonts w:ascii="BRH Malayalam Extra" w:hAnsi="BRH Malayalam Extra" w:cs="BRH Malayalam Extra"/>
-                <w:sz w:val="40"/>
-                <w:szCs w:val="40"/>
-                <w:lang w:val="en-IN" w:eastAsia="en-IN"/>
-              </w:rPr>
-              <w:t>— |</w:t>
-            </w:r>
-          </w:p>
-        </w:tc>
-      </w:tr>
-      <w:tr>
-        <w:trPr>
-          <w:trHeight w:val="1729"/>
-        </w:trPr>
-        <w:tc>
-          <w:tcPr>
-            <w:tcW w:w="3006" w:type="dxa"/>
-            <w:tcBorders>
-              <w:top w:val="single" w:sz="4" w:space="0" w:color="000000"/>
-              <w:left w:val="single" w:sz="4" w:space="0" w:color="000000"/>
-              <w:bottom w:val="single" w:sz="4" w:space="0" w:color="auto"/>
-              <w:right w:val="single" w:sz="4" w:space="0" w:color="000000"/>
-            </w:tcBorders>
-          </w:tcPr>
-          <w:p>
-            <w:pPr>
-              <w:spacing w:before="0" w:line="240" w:lineRule="auto"/>
-              <w:ind w:left="29"/>
-              <w:rPr>
-                <w:rFonts w:cs="Arial"/>
-                <w:b/>
-                <w:color w:val="000000"/>
-                <w:sz w:val="32"/>
-                <w:szCs w:val="32"/>
-                <w:lang w:val="it-IT"/>
-              </w:rPr>
-            </w:pPr>
-            <w:r>
-              <w:rPr>
-                <w:rFonts w:cs="Arial"/>
-                <w:b/>
-                <w:color w:val="000000"/>
-                <w:sz w:val="32"/>
-                <w:szCs w:val="32"/>
-                <w:lang w:val="it-IT"/>
-              </w:rPr>
-              <w:t>1.1.</w:t>
-            </w:r>
-            <w:r>
-              <w:rPr>
-                <w:rFonts w:cs="Arial"/>
-                <w:b/>
-                <w:color w:val="000000"/>
-                <w:sz w:val="32"/>
-                <w:szCs w:val="32"/>
-                <w:lang w:val="it-IT"/>
-              </w:rPr>
-              <w:t>10</w:t>
-            </w:r>
-            <w:r>
-              <w:rPr>
-                <w:rFonts w:cs="Arial"/>
-                <w:b/>
-                <w:color w:val="000000"/>
-                <w:sz w:val="32"/>
-                <w:szCs w:val="32"/>
-                <w:lang w:val="it-IT"/>
-              </w:rPr>
-              <w:t>.1 – Padam</w:t>
-            </w:r>
-          </w:p>
-          <w:p>
-            <w:pPr>
-              <w:spacing w:before="0" w:line="240" w:lineRule="auto"/>
-              <w:ind w:left="29"/>
-              <w:rPr>
-                <w:rFonts w:cs="Arial"/>
-                <w:b/>
-                <w:color w:val="000000"/>
-                <w:sz w:val="32"/>
-                <w:szCs w:val="32"/>
-                <w:lang w:val="it-IT"/>
-              </w:rPr>
-            </w:pPr>
-            <w:r>
-              <w:rPr>
-                <w:rFonts w:cs="Arial"/>
-                <w:b/>
-                <w:color w:val="000000"/>
-                <w:sz w:val="32"/>
-                <w:szCs w:val="32"/>
-                <w:lang w:val="it-IT"/>
-              </w:rPr>
-              <w:t xml:space="preserve">Padam No.- </w:t>
-            </w:r>
-            <w:r>
-              <w:rPr>
-                <w:rFonts w:cs="Arial"/>
-                <w:b/>
-                <w:color w:val="000000"/>
-                <w:sz w:val="32"/>
-                <w:szCs w:val="32"/>
-                <w:lang w:val="it-IT"/>
-              </w:rPr>
-              <w:t>21</w:t>
-            </w:r>
-          </w:p>
-          <w:p>
-            <w:pPr>
-              <w:spacing w:before="0" w:line="240" w:lineRule="auto"/>
-              <w:ind w:left="29"/>
-              <w:jc w:val="center"/>
-              <w:rPr>
-                <w:rFonts w:cs="Arial"/>
-                <w:color w:val="000000"/>
-                <w:sz w:val="32"/>
-                <w:szCs w:val="32"/>
-                <w:lang w:val="it-IT"/>
-              </w:rPr>
-            </w:pPr>
-            <w:r>
-              <w:rPr>
-                <w:rFonts w:cs="Arial"/>
-                <w:b/>
-                <w:color w:val="000000"/>
-                <w:sz w:val="32"/>
-                <w:szCs w:val="32"/>
-                <w:lang w:val="it-IT"/>
-              </w:rPr>
-              <w:t xml:space="preserve">Panchaati No. - </w:t>
-            </w:r>
-            <w:r>
-              <w:rPr>
-                <w:rFonts w:cs="Arial"/>
-                <w:b/>
-                <w:color w:val="000000"/>
-                <w:sz w:val="32"/>
-                <w:szCs w:val="32"/>
-                <w:lang w:val="it-IT"/>
-              </w:rPr>
-              <w:t>16</w:t>
-            </w:r>
-          </w:p>
-        </w:tc>
-        <w:tc>
-          <w:tcPr>
-            <w:tcW w:w="5244" w:type="dxa"/>
-            <w:tcBorders>
-              <w:top w:val="single" w:sz="4" w:space="0" w:color="000000"/>
-              <w:left w:val="single" w:sz="4" w:space="0" w:color="000000"/>
-              <w:bottom w:val="single" w:sz="4" w:space="0" w:color="auto"/>
-              <w:right w:val="single" w:sz="4" w:space="0" w:color="000000"/>
-            </w:tcBorders>
-          </w:tcPr>
-          <w:p>
-            <w:pPr>
-              <w:widowControl w:val="0"/>
-              <w:autoSpaceDE w:val="0"/>
-              <w:autoSpaceDN w:val="0"/>
-              <w:adjustRightInd w:val="0"/>
-              <w:spacing w:before="0" w:line="240" w:lineRule="auto"/>
-              <w:ind w:right="-136"/>
-              <w:rPr>
-                <w:rFonts w:ascii="BRH Malayalam Extra" w:hAnsi="BRH Malayalam Extra" w:cs="BRH Malayalam Extra"/>
-                <w:sz w:val="40"/>
-                <w:szCs w:val="40"/>
-                <w:lang w:val="it-IT" w:eastAsia="en-IN"/>
-              </w:rPr>
-            </w:pPr>
-            <w:r>
-              <w:rPr>
-                <w:rFonts w:ascii="BRH Malayalam Extra" w:hAnsi="BRH Malayalam Extra" w:cs="BRH Malayalam Extra"/>
-                <w:sz w:val="40"/>
-                <w:szCs w:val="40"/>
-                <w:lang w:val="it-IT" w:eastAsia="en-IN"/>
-              </w:rPr>
-              <w:t xml:space="preserve">pxP˜I | </w:t>
-            </w:r>
-          </w:p>
-          <w:p>
-            <w:pPr>
-              <w:widowControl w:val="0"/>
-              <w:autoSpaceDE w:val="0"/>
-              <w:autoSpaceDN w:val="0"/>
-              <w:adjustRightInd w:val="0"/>
-              <w:spacing w:before="0" w:line="240" w:lineRule="auto"/>
-              <w:ind w:right="-136"/>
-              <w:rPr>
-                <w:rFonts w:ascii="BRH Malayalam Extra" w:hAnsi="BRH Malayalam Extra" w:cs="BRH Malayalam Extra"/>
-                <w:color w:val="000000"/>
-                <w:sz w:val="40"/>
-                <w:szCs w:val="40"/>
-                <w:lang w:val="it-IT" w:eastAsia="en-IN"/>
-              </w:rPr>
-            </w:pPr>
-            <w:r>
-              <w:rPr>
-                <w:rFonts w:ascii="BRH Malayalam Extra" w:hAnsi="BRH Malayalam Extra" w:cs="BRH Malayalam Extra"/>
-                <w:sz w:val="40"/>
-                <w:szCs w:val="40"/>
-                <w:lang w:val="it-IT" w:eastAsia="en-IN"/>
-              </w:rPr>
-              <w:t>öex</w:t>
-            </w:r>
-            <w:r>
-              <w:rPr>
-                <w:rFonts w:ascii="BRH Malayalam Extra" w:hAnsi="BRH Malayalam Extra" w:cs="BRH Malayalam Extra"/>
-                <w:sz w:val="32"/>
-                <w:szCs w:val="40"/>
-                <w:lang w:val="it-IT" w:eastAsia="en-IN"/>
-              </w:rPr>
-              <w:t>–</w:t>
-            </w:r>
-            <w:r>
-              <w:rPr>
-                <w:rFonts w:ascii="BRH Malayalam Extra" w:hAnsi="BRH Malayalam Extra" w:cs="BRH Malayalam Extra"/>
-                <w:sz w:val="40"/>
-                <w:szCs w:val="40"/>
-                <w:lang w:val="it-IT" w:eastAsia="en-IN"/>
-              </w:rPr>
-              <w:t xml:space="preserve">YiyZy— </w:t>
-            </w:r>
-            <w:r>
-              <w:rPr>
-                <w:rFonts w:ascii="BRH Malayalam Extra" w:hAnsi="BRH Malayalam Extra" w:cs="BRH Malayalam Extra"/>
-                <w:sz w:val="40"/>
-                <w:szCs w:val="40"/>
-                <w:highlight w:val="yellow"/>
-                <w:lang w:val="it-IT" w:eastAsia="en-IN"/>
-              </w:rPr>
-              <w:t>öex</w:t>
-            </w:r>
-            <w:r>
-              <w:rPr>
-                <w:rFonts w:ascii="BRH Malayalam Extra" w:hAnsi="BRH Malayalam Extra" w:cs="BRH Malayalam Extra"/>
-                <w:sz w:val="40"/>
-                <w:szCs w:val="40"/>
-                <w:lang w:val="it-IT" w:eastAsia="en-IN"/>
-              </w:rPr>
-              <w:t xml:space="preserve"> - A</w:t>
-            </w:r>
-            <w:r>
-              <w:rPr>
-                <w:rFonts w:ascii="BRH Malayalam Extra" w:hAnsi="BRH Malayalam Extra" w:cs="BRH Malayalam Extra"/>
-                <w:sz w:val="32"/>
-                <w:szCs w:val="40"/>
-                <w:lang w:val="it-IT" w:eastAsia="en-IN"/>
-              </w:rPr>
-              <w:t>–</w:t>
-            </w:r>
-            <w:r>
-              <w:rPr>
-                <w:rFonts w:ascii="BRH Malayalam Extra" w:hAnsi="BRH Malayalam Extra" w:cs="BRH Malayalam Extra"/>
-                <w:sz w:val="40"/>
-                <w:szCs w:val="40"/>
-                <w:lang w:val="it-IT" w:eastAsia="en-IN"/>
-              </w:rPr>
-              <w:t>dI |</w:t>
-            </w:r>
-          </w:p>
-        </w:tc>
-        <w:tc>
-          <w:tcPr>
-            <w:tcW w:w="5103" w:type="dxa"/>
-            <w:tcBorders>
-              <w:top w:val="single" w:sz="4" w:space="0" w:color="000000"/>
-              <w:left w:val="single" w:sz="4" w:space="0" w:color="000000"/>
-              <w:bottom w:val="single" w:sz="4" w:space="0" w:color="auto"/>
-              <w:right w:val="single" w:sz="4" w:space="0" w:color="000000"/>
-            </w:tcBorders>
-          </w:tcPr>
-          <w:p>
-            <w:pPr>
-              <w:widowControl w:val="0"/>
-              <w:autoSpaceDE w:val="0"/>
-              <w:autoSpaceDN w:val="0"/>
-              <w:adjustRightInd w:val="0"/>
-              <w:spacing w:before="0" w:line="240" w:lineRule="auto"/>
-              <w:ind w:right="-136"/>
-              <w:rPr>
-                <w:rFonts w:ascii="BRH Malayalam Extra" w:hAnsi="BRH Malayalam Extra" w:cs="BRH Malayalam Extra"/>
-                <w:sz w:val="40"/>
-                <w:szCs w:val="40"/>
-                <w:lang w:val="it-IT" w:eastAsia="en-IN"/>
-              </w:rPr>
-            </w:pPr>
-            <w:r>
-              <w:rPr>
-                <w:rFonts w:ascii="BRH Malayalam Extra" w:hAnsi="BRH Malayalam Extra" w:cs="BRH Malayalam Extra"/>
-                <w:sz w:val="40"/>
-                <w:szCs w:val="40"/>
-                <w:lang w:val="it-IT" w:eastAsia="en-IN"/>
-              </w:rPr>
-              <w:t xml:space="preserve">pxP˜I | </w:t>
-            </w:r>
-          </w:p>
-          <w:p>
-            <w:pPr>
-              <w:widowControl w:val="0"/>
-              <w:autoSpaceDE w:val="0"/>
-              <w:autoSpaceDN w:val="0"/>
-              <w:adjustRightInd w:val="0"/>
-              <w:spacing w:before="0" w:line="240" w:lineRule="auto"/>
-              <w:rPr>
-                <w:rFonts w:ascii="BRH Malayalam Extra" w:hAnsi="BRH Malayalam Extra" w:cs="BRH Malayalam Extra"/>
-                <w:color w:val="000000"/>
-                <w:sz w:val="40"/>
-                <w:szCs w:val="40"/>
-                <w:lang w:val="it-IT" w:eastAsia="en-IN"/>
-              </w:rPr>
-            </w:pPr>
-            <w:r>
-              <w:rPr>
-                <w:rFonts w:ascii="BRH Malayalam Extra" w:hAnsi="BRH Malayalam Extra" w:cs="BRH Malayalam Extra"/>
-                <w:sz w:val="40"/>
-                <w:szCs w:val="40"/>
-                <w:lang w:val="it-IT" w:eastAsia="en-IN"/>
-              </w:rPr>
-              <w:t>öex</w:t>
-            </w:r>
-            <w:r>
-              <w:rPr>
-                <w:rFonts w:ascii="BRH Malayalam Extra" w:hAnsi="BRH Malayalam Extra" w:cs="BRH Malayalam Extra"/>
-                <w:sz w:val="32"/>
-                <w:szCs w:val="40"/>
-                <w:lang w:val="it-IT" w:eastAsia="en-IN"/>
-              </w:rPr>
-              <w:t>–</w:t>
-            </w:r>
-            <w:r>
-              <w:rPr>
-                <w:rFonts w:ascii="BRH Malayalam Extra" w:hAnsi="BRH Malayalam Extra" w:cs="BRH Malayalam Extra"/>
-                <w:sz w:val="40"/>
-                <w:szCs w:val="40"/>
-                <w:lang w:val="it-IT" w:eastAsia="en-IN"/>
-              </w:rPr>
-              <w:t xml:space="preserve">YiyZy— </w:t>
-            </w:r>
-            <w:r>
-              <w:rPr>
-                <w:rFonts w:ascii="BRH Malayalam Extra" w:hAnsi="BRH Malayalam Extra" w:cs="BRH Malayalam Extra"/>
-                <w:sz w:val="40"/>
-                <w:szCs w:val="40"/>
-                <w:highlight w:val="green"/>
-                <w:lang w:val="it-IT" w:eastAsia="en-IN"/>
-              </w:rPr>
-              <w:t>öe</w:t>
-            </w:r>
-            <w:r>
-              <w:rPr>
-                <w:rFonts w:ascii="BRH Malayalam Extra" w:hAnsi="BRH Malayalam Extra" w:cs="BRH Malayalam Extra"/>
-                <w:sz w:val="40"/>
-                <w:szCs w:val="40"/>
-                <w:lang w:val="it-IT" w:eastAsia="en-IN"/>
-              </w:rPr>
-              <w:t xml:space="preserve"> - A</w:t>
-            </w:r>
-            <w:r>
-              <w:rPr>
-                <w:rFonts w:ascii="BRH Malayalam Extra" w:hAnsi="BRH Malayalam Extra" w:cs="BRH Malayalam Extra"/>
-                <w:sz w:val="32"/>
-                <w:szCs w:val="40"/>
-                <w:lang w:val="it-IT" w:eastAsia="en-IN"/>
-              </w:rPr>
-              <w:t>–</w:t>
-            </w:r>
-            <w:r>
-              <w:rPr>
-                <w:rFonts w:ascii="BRH Malayalam Extra" w:hAnsi="BRH Malayalam Extra" w:cs="BRH Malayalam Extra"/>
-                <w:sz w:val="40"/>
-                <w:szCs w:val="40"/>
-                <w:lang w:val="it-IT" w:eastAsia="en-IN"/>
-              </w:rPr>
-              <w:t>dI |</w:t>
-            </w:r>
-          </w:p>
-        </w:tc>
-      </w:tr>
-    </w:tbl>
-    <w:p>
-      <w:pPr>
-        <w:jc w:val="center"/>
-        <w:rPr>
-          <w:b/>
-          <w:bCs/>
-          <w:sz w:val="32"/>
-          <w:szCs w:val="32"/>
-          <w:u w:val="single"/>
-        </w:rPr>
-      </w:pPr>
-      <w:r>
-        <w:rPr>
-          <w:b/>
-          <w:bCs/>
-          <w:sz w:val="32"/>
-          <w:szCs w:val="32"/>
-          <w:u w:val="single"/>
-        </w:rPr>
-        <w:t>================</w:t>
-      </w:r>
-    </w:p>
-    <w:p>
-      <w:pPr>
-        <w:jc w:val="center"/>
-        <w:rPr>
-          <w:b/>
-          <w:bCs/>
-          <w:sz w:val="32"/>
-          <w:szCs w:val="32"/>
-          <w:u w:val="single"/>
-        </w:rPr>
-      </w:pPr>
-    </w:p>
-    <w:p>
-      <w:pPr>
-        <w:jc w:val="center"/>
-        <w:rPr>
-          <w:b/>
-          <w:bCs/>
-          <w:sz w:val="32"/>
-          <w:szCs w:val="32"/>
-          <w:u w:val="single"/>
-        </w:rPr>
-      </w:pPr>
-    </w:p>
-    <w:p>
-      <w:pPr>
-        <w:jc w:val="center"/>
-        <w:rPr>
-          <w:b/>
-          <w:bCs/>
-          <w:sz w:val="32"/>
-          <w:szCs w:val="32"/>
-          <w:u w:val="single"/>
-        </w:rPr>
-      </w:pPr>
-    </w:p>
     <w:p>
       <w:pPr>
         <w:jc w:val="center"/>
@@ -1170,7 +200,7 @@
       </w:tr>
       <w:tr>
         <w:trPr>
-          <w:trHeight w:val="1020"/>
+          <w:trHeight w:val="1161"/>
         </w:trPr>
         <w:tc>
           <w:tcPr>
@@ -1186,23 +216,119 @@
             <w:pPr>
               <w:spacing w:before="0" w:line="240" w:lineRule="auto"/>
               <w:ind w:left="29"/>
-              <w:jc w:val="center"/>
-              <w:rPr>
-                <w:rFonts w:cs="Arial"/>
-                <w:color w:val="000000"/>
-                <w:sz w:val="32"/>
-                <w:szCs w:val="32"/>
-              </w:rPr>
-            </w:pPr>
-            <w:r>
-              <w:rPr>
-                <w:rFonts w:cs="Arial"/>
-                <w:color w:val="000000"/>
-                <w:sz w:val="32"/>
-                <w:szCs w:val="32"/>
-              </w:rPr>
-              <w:lastRenderedPageBreak/>
-              <w:t>None</w:t>
+              <w:rPr>
+                <w:rFonts w:cs="Arial"/>
+                <w:b/>
+                <w:color w:val="000000"/>
+                <w:sz w:val="32"/>
+                <w:szCs w:val="32"/>
+                <w:lang w:val="it-IT"/>
+              </w:rPr>
+            </w:pPr>
+            <w:r>
+              <w:rPr>
+                <w:rFonts w:cs="Arial"/>
+                <w:b/>
+                <w:color w:val="000000"/>
+                <w:sz w:val="32"/>
+                <w:szCs w:val="32"/>
+                <w:lang w:val="it-IT"/>
+              </w:rPr>
+              <w:t>1.1.</w:t>
+            </w:r>
+            <w:r>
+              <w:rPr>
+                <w:rFonts w:cs="Arial"/>
+                <w:b/>
+                <w:color w:val="000000"/>
+                <w:sz w:val="32"/>
+                <w:szCs w:val="32"/>
+                <w:lang w:val="it-IT"/>
+              </w:rPr>
+              <w:t>9.3</w:t>
+            </w:r>
+            <w:r>
+              <w:rPr>
+                <w:rFonts w:cs="Arial"/>
+                <w:b/>
+                <w:color w:val="000000"/>
+                <w:sz w:val="32"/>
+                <w:szCs w:val="32"/>
+                <w:lang w:val="it-IT"/>
+              </w:rPr>
+              <w:t xml:space="preserve"> – Padam</w:t>
+            </w:r>
+          </w:p>
+          <w:p>
+            <w:pPr>
+              <w:spacing w:before="0" w:line="240" w:lineRule="auto"/>
+              <w:ind w:left="29"/>
+              <w:rPr>
+                <w:rFonts w:cs="Arial"/>
+                <w:b/>
+                <w:color w:val="000000"/>
+                <w:sz w:val="32"/>
+                <w:szCs w:val="32"/>
+                <w:lang w:val="it-IT"/>
+              </w:rPr>
+            </w:pPr>
+            <w:r>
+              <w:rPr>
+                <w:rFonts w:cs="Arial"/>
+                <w:b/>
+                <w:color w:val="000000"/>
+                <w:sz w:val="32"/>
+                <w:szCs w:val="32"/>
+                <w:lang w:val="it-IT"/>
+              </w:rPr>
+              <w:t xml:space="preserve">Padam No.- </w:t>
+            </w:r>
+            <w:r>
+              <w:rPr>
+                <w:rFonts w:cs="Arial"/>
+                <w:b/>
+                <w:color w:val="000000"/>
+                <w:sz w:val="32"/>
+                <w:szCs w:val="32"/>
+                <w:lang w:val="it-IT"/>
+              </w:rPr>
+              <w:t>43</w:t>
+            </w:r>
+          </w:p>
+          <w:p>
+            <w:pPr>
+              <w:spacing w:before="0" w:line="240" w:lineRule="auto"/>
+              <w:ind w:left="29"/>
+              <w:rPr>
+                <w:rFonts w:cs="Arial"/>
+                <w:b/>
+                <w:color w:val="000000"/>
+                <w:sz w:val="32"/>
+                <w:szCs w:val="32"/>
+                <w:lang w:val="it-IT"/>
+              </w:rPr>
+            </w:pPr>
+            <w:r>
+              <w:rPr>
+                <w:rFonts w:cs="Arial"/>
+                <w:b/>
+                <w:color w:val="000000"/>
+                <w:sz w:val="32"/>
+                <w:szCs w:val="32"/>
+                <w:lang w:val="it-IT"/>
+              </w:rPr>
+              <w:t xml:space="preserve">Panchaati No. - </w:t>
+            </w:r>
+            <w:r>
+              <w:rPr>
+                <w:rFonts w:cs="Arial"/>
+                <w:b/>
+                <w:color w:val="000000"/>
+                <w:sz w:val="32"/>
+                <w:szCs w:val="32"/>
+                <w:lang w:val="it-IT"/>
+              </w:rPr>
+              <w:t>15</w:t>
             </w:r>
           </w:p>
         </w:tc>
@@ -1222,25 +348,107 @@
               <w:autoSpaceDE w:val="0"/>
               <w:autoSpaceDN w:val="0"/>
               <w:adjustRightInd w:val="0"/>
-              <w:spacing w:line="240" w:lineRule="auto"/>
-              <w:ind w:right="-138"/>
-              <w:jc w:val="center"/>
-              <w:rPr>
-                <w:rFonts w:ascii="BRH Malayalam Extra" w:hAnsi="BRH Malayalam Extra" w:cs="BRH Malayalam Extra"/>
-                <w:color w:val="000000"/>
-                <w:sz w:val="40"/>
-                <w:szCs w:val="40"/>
-                <w:lang w:val="en-IN" w:eastAsia="en-IN"/>
-              </w:rPr>
-            </w:pPr>
-            <w:r>
-              <w:rPr>
-                <w:rFonts w:cs="Arial"/>
-                <w:color w:val="000000"/>
-                <w:sz w:val="32"/>
-                <w:szCs w:val="32"/>
-              </w:rPr>
-              <w:t>None</w:t>
+              <w:spacing w:before="0" w:line="240" w:lineRule="auto"/>
+              <w:ind w:right="-136"/>
+              <w:rPr>
+                <w:rFonts w:ascii="BRH Malayalam Extra" w:hAnsi="BRH Malayalam Extra" w:cs="BRH Malayalam Extra"/>
+                <w:sz w:val="40"/>
+                <w:szCs w:val="40"/>
+                <w:lang w:val="en-IN" w:eastAsia="en-IN"/>
+              </w:rPr>
+            </w:pPr>
+            <w:r>
+              <w:rPr>
+                <w:rFonts w:ascii="BRH Malayalam Extra" w:hAnsi="BRH Malayalam Extra" w:cs="BRH Malayalam Extra"/>
+                <w:sz w:val="40"/>
+                <w:szCs w:val="40"/>
+                <w:lang w:val="en-IN" w:eastAsia="en-IN"/>
+              </w:rPr>
+              <w:t>D</w:t>
+            </w:r>
+            <w:r>
+              <w:rPr>
+                <w:rFonts w:ascii="BRH Malayalam Extra" w:hAnsi="BRH Malayalam Extra" w:cs="BRH Malayalam Extra"/>
+                <w:sz w:val="32"/>
+                <w:szCs w:val="40"/>
+                <w:lang w:val="en-IN" w:eastAsia="en-IN"/>
+              </w:rPr>
+              <w:t>–</w:t>
+            </w:r>
+            <w:r>
+              <w:rPr>
+                <w:rFonts w:ascii="BRH Malayalam Extra" w:hAnsi="BRH Malayalam Extra" w:cs="BRH Malayalam Extra"/>
+                <w:sz w:val="40"/>
+                <w:szCs w:val="40"/>
+                <w:lang w:val="en-IN" w:eastAsia="en-IN"/>
+              </w:rPr>
+              <w:t>ªpz | P</w:t>
+            </w:r>
+            <w:r>
+              <w:rPr>
+                <w:rFonts w:ascii="BRH Malayalam Extra" w:hAnsi="BRH Malayalam Extra" w:cs="BRH Malayalam Extra"/>
+                <w:sz w:val="32"/>
+                <w:szCs w:val="40"/>
+                <w:lang w:val="en-IN" w:eastAsia="en-IN"/>
+              </w:rPr>
+              <w:t>–</w:t>
+            </w:r>
+            <w:r>
+              <w:rPr>
+                <w:rFonts w:ascii="BRH Malayalam Extra" w:hAnsi="BRH Malayalam Extra" w:cs="BRH Malayalam Extra"/>
+                <w:sz w:val="40"/>
+                <w:szCs w:val="40"/>
+                <w:lang w:val="en-IN" w:eastAsia="en-IN"/>
+              </w:rPr>
+              <w:t xml:space="preserve"> | </w:t>
+            </w:r>
+            <w:r>
+              <w:rPr>
+                <w:rFonts w:ascii="BRH Malayalam Extra" w:hAnsi="BRH Malayalam Extra" w:cs="BRH Malayalam Extra"/>
+                <w:sz w:val="40"/>
+                <w:szCs w:val="40"/>
+                <w:highlight w:val="yellow"/>
+                <w:lang w:val="en-IN" w:eastAsia="en-IN"/>
+              </w:rPr>
+              <w:t>A</w:t>
+            </w:r>
+            <w:r>
+              <w:rPr>
+                <w:rFonts w:ascii="BRH Malayalam Extra" w:hAnsi="BRH Malayalam Extra" w:cs="BRH Malayalam Extra"/>
+                <w:sz w:val="32"/>
+                <w:szCs w:val="40"/>
+                <w:highlight w:val="yellow"/>
+                <w:lang w:val="en-IN" w:eastAsia="en-IN"/>
+              </w:rPr>
+              <w:t>–</w:t>
+            </w:r>
+            <w:r>
+              <w:rPr>
+                <w:rFonts w:ascii="BRH Malayalam Extra" w:hAnsi="BRH Malayalam Extra" w:cs="BRH Malayalam Extra"/>
+                <w:sz w:val="40"/>
+                <w:szCs w:val="40"/>
+                <w:highlight w:val="yellow"/>
+                <w:lang w:val="en-IN" w:eastAsia="en-IN"/>
+              </w:rPr>
+              <w:t>sy</w:t>
+            </w:r>
+            <w:r>
+              <w:rPr>
+                <w:rFonts w:ascii="BRH Malayalam Extra" w:hAnsi="BRH Malayalam Extra" w:cs="BRH Malayalam Extra"/>
+                <w:sz w:val="32"/>
+                <w:szCs w:val="40"/>
+                <w:lang w:val="en-IN" w:eastAsia="en-IN"/>
+              </w:rPr>
+              <w:t>–</w:t>
+            </w:r>
+            <w:r>
+              <w:rPr>
+                <w:rFonts w:ascii="BRH Malayalam Extra" w:hAnsi="BRH Malayalam Extra" w:cs="BRH Malayalam Extra"/>
+                <w:sz w:val="40"/>
+                <w:szCs w:val="40"/>
+                <w:lang w:val="en-IN" w:eastAsia="en-IN"/>
+              </w:rPr>
+              <w:t xml:space="preserve"> |</w:t>
             </w:r>
           </w:p>
         </w:tc>
@@ -1261,22 +469,445 @@
               <w:autoSpaceDN w:val="0"/>
               <w:adjustRightInd w:val="0"/>
               <w:spacing w:before="0" w:line="240" w:lineRule="auto"/>
-              <w:rPr>
-                <w:rFonts w:ascii="BRH Malayalam Extra" w:hAnsi="BRH Malayalam Extra" w:cs="BRH Malayalam Extra"/>
-                <w:color w:val="000000"/>
-                <w:sz w:val="40"/>
-                <w:szCs w:val="40"/>
-                <w:lang w:val="en-IN" w:eastAsia="en-IN"/>
-              </w:rPr>
-            </w:pPr>
-            <w:r>
-              <w:rPr>
-                <w:rFonts w:cs="Arial"/>
-                <w:color w:val="000000"/>
-                <w:sz w:val="32"/>
-                <w:szCs w:val="32"/>
-              </w:rPr>
-              <w:t>None</w:t>
+              <w:ind w:right="-136"/>
+              <w:rPr>
+                <w:rFonts w:ascii="BRH Malayalam Extra" w:hAnsi="BRH Malayalam Extra" w:cs="BRH Malayalam Extra"/>
+                <w:sz w:val="40"/>
+                <w:szCs w:val="40"/>
+                <w:lang w:val="en-IN" w:eastAsia="en-IN"/>
+              </w:rPr>
+            </w:pPr>
+            <w:r>
+              <w:rPr>
+                <w:rFonts w:ascii="BRH Malayalam Extra" w:hAnsi="BRH Malayalam Extra" w:cs="BRH Malayalam Extra"/>
+                <w:sz w:val="40"/>
+                <w:szCs w:val="40"/>
+                <w:lang w:val="en-IN" w:eastAsia="en-IN"/>
+              </w:rPr>
+              <w:t>D</w:t>
+            </w:r>
+            <w:r>
+              <w:rPr>
+                <w:rFonts w:ascii="BRH Malayalam Extra" w:hAnsi="BRH Malayalam Extra" w:cs="BRH Malayalam Extra"/>
+                <w:sz w:val="32"/>
+                <w:szCs w:val="40"/>
+                <w:lang w:val="en-IN" w:eastAsia="en-IN"/>
+              </w:rPr>
+              <w:t>–</w:t>
+            </w:r>
+            <w:r>
+              <w:rPr>
+                <w:rFonts w:ascii="BRH Malayalam Extra" w:hAnsi="BRH Malayalam Extra" w:cs="BRH Malayalam Extra"/>
+                <w:sz w:val="40"/>
+                <w:szCs w:val="40"/>
+                <w:lang w:val="en-IN" w:eastAsia="en-IN"/>
+              </w:rPr>
+              <w:t>ªpz | P</w:t>
+            </w:r>
+            <w:r>
+              <w:rPr>
+                <w:rFonts w:ascii="BRH Malayalam Extra" w:hAnsi="BRH Malayalam Extra" w:cs="BRH Malayalam Extra"/>
+                <w:sz w:val="32"/>
+                <w:szCs w:val="40"/>
+                <w:lang w:val="en-IN" w:eastAsia="en-IN"/>
+              </w:rPr>
+              <w:t>–</w:t>
+            </w:r>
+            <w:r>
+              <w:rPr>
+                <w:rFonts w:ascii="BRH Malayalam Extra" w:hAnsi="BRH Malayalam Extra" w:cs="BRH Malayalam Extra"/>
+                <w:sz w:val="40"/>
+                <w:szCs w:val="40"/>
+                <w:lang w:val="en-IN" w:eastAsia="en-IN"/>
+              </w:rPr>
+              <w:t xml:space="preserve"> | </w:t>
+            </w:r>
+            <w:r>
+              <w:rPr>
+                <w:rFonts w:ascii="BRH Malayalam Extra" w:hAnsi="BRH Malayalam Extra" w:cs="BRH Malayalam Extra"/>
+                <w:sz w:val="40"/>
+                <w:szCs w:val="40"/>
+                <w:highlight w:val="green"/>
+                <w:lang w:val="en-IN" w:eastAsia="en-IN"/>
+              </w:rPr>
+              <w:t>Asy</w:t>
+            </w:r>
+            <w:r>
+              <w:rPr>
+                <w:rFonts w:ascii="BRH Malayalam Extra" w:hAnsi="BRH Malayalam Extra" w:cs="BRH Malayalam Extra"/>
+                <w:sz w:val="40"/>
+                <w:szCs w:val="40"/>
+                <w:lang w:val="en-IN" w:eastAsia="en-IN"/>
+              </w:rPr>
+              <w:t>— |</w:t>
+            </w:r>
+          </w:p>
+        </w:tc>
+      </w:tr>
+      <w:tr>
+        <w:trPr>
+          <w:trHeight w:val="1729"/>
+        </w:trPr>
+        <w:tc>
+          <w:tcPr>
+            <w:tcW w:w="3006" w:type="dxa"/>
+            <w:tcBorders>
+              <w:top w:val="single" w:sz="4" w:space="0" w:color="000000"/>
+              <w:left w:val="single" w:sz="4" w:space="0" w:color="000000"/>
+              <w:bottom w:val="single" w:sz="4" w:space="0" w:color="auto"/>
+              <w:right w:val="single" w:sz="4" w:space="0" w:color="000000"/>
+            </w:tcBorders>
+          </w:tcPr>
+          <w:p>
+            <w:pPr>
+              <w:spacing w:before="0" w:line="240" w:lineRule="auto"/>
+              <w:ind w:left="29"/>
+              <w:rPr>
+                <w:rFonts w:cs="Arial"/>
+                <w:b/>
+                <w:color w:val="000000"/>
+                <w:sz w:val="32"/>
+                <w:szCs w:val="32"/>
+                <w:lang w:val="it-IT"/>
+              </w:rPr>
+            </w:pPr>
+            <w:r>
+              <w:rPr>
+                <w:rFonts w:cs="Arial"/>
+                <w:b/>
+                <w:color w:val="000000"/>
+                <w:sz w:val="32"/>
+                <w:szCs w:val="32"/>
+                <w:lang w:val="it-IT"/>
+              </w:rPr>
+              <w:t>1.1.</w:t>
+            </w:r>
+            <w:r>
+              <w:rPr>
+                <w:rFonts w:cs="Arial"/>
+                <w:b/>
+                <w:color w:val="000000"/>
+                <w:sz w:val="32"/>
+                <w:szCs w:val="32"/>
+                <w:lang w:val="it-IT"/>
+              </w:rPr>
+              <w:t>10</w:t>
+            </w:r>
+            <w:r>
+              <w:rPr>
+                <w:rFonts w:cs="Arial"/>
+                <w:b/>
+                <w:color w:val="000000"/>
+                <w:sz w:val="32"/>
+                <w:szCs w:val="32"/>
+                <w:lang w:val="it-IT"/>
+              </w:rPr>
+              <w:t>.1 – Padam</w:t>
+            </w:r>
+          </w:p>
+          <w:p>
+            <w:pPr>
+              <w:spacing w:before="0" w:line="240" w:lineRule="auto"/>
+              <w:ind w:left="29"/>
+              <w:rPr>
+                <w:rFonts w:cs="Arial"/>
+                <w:b/>
+                <w:color w:val="000000"/>
+                <w:sz w:val="32"/>
+                <w:szCs w:val="32"/>
+                <w:lang w:val="it-IT"/>
+              </w:rPr>
+            </w:pPr>
+            <w:r>
+              <w:rPr>
+                <w:rFonts w:cs="Arial"/>
+                <w:b/>
+                <w:color w:val="000000"/>
+                <w:sz w:val="32"/>
+                <w:szCs w:val="32"/>
+                <w:lang w:val="it-IT"/>
+              </w:rPr>
+              <w:t xml:space="preserve">Padam No.- </w:t>
+            </w:r>
+            <w:r>
+              <w:rPr>
+                <w:rFonts w:cs="Arial"/>
+                <w:b/>
+                <w:color w:val="000000"/>
+                <w:sz w:val="32"/>
+                <w:szCs w:val="32"/>
+                <w:lang w:val="it-IT"/>
+              </w:rPr>
+              <w:t>21</w:t>
+            </w:r>
+          </w:p>
+          <w:p>
+            <w:pPr>
+              <w:spacing w:before="0" w:line="240" w:lineRule="auto"/>
+              <w:ind w:left="29"/>
+              <w:jc w:val="center"/>
+              <w:rPr>
+                <w:rFonts w:cs="Arial"/>
+                <w:color w:val="000000"/>
+                <w:sz w:val="32"/>
+                <w:szCs w:val="32"/>
+                <w:lang w:val="it-IT"/>
+              </w:rPr>
+            </w:pPr>
+            <w:r>
+              <w:rPr>
+                <w:rFonts w:cs="Arial"/>
+                <w:b/>
+                <w:color w:val="000000"/>
+                <w:sz w:val="32"/>
+                <w:szCs w:val="32"/>
+                <w:lang w:val="it-IT"/>
+              </w:rPr>
+              <w:t xml:space="preserve">Panchaati No. - </w:t>
+            </w:r>
+            <w:r>
+              <w:rPr>
+                <w:rFonts w:cs="Arial"/>
+                <w:b/>
+                <w:color w:val="000000"/>
+                <w:sz w:val="32"/>
+                <w:szCs w:val="32"/>
+                <w:lang w:val="it-IT"/>
+              </w:rPr>
+              <w:t>16</w:t>
+            </w:r>
+          </w:p>
+        </w:tc>
+        <w:tc>
+          <w:tcPr>
+            <w:tcW w:w="5244" w:type="dxa"/>
+            <w:tcBorders>
+              <w:top w:val="single" w:sz="4" w:space="0" w:color="000000"/>
+              <w:left w:val="single" w:sz="4" w:space="0" w:color="000000"/>
+              <w:bottom w:val="single" w:sz="4" w:space="0" w:color="auto"/>
+              <w:right w:val="single" w:sz="4" w:space="0" w:color="000000"/>
+            </w:tcBorders>
+          </w:tcPr>
+          <w:p>
+            <w:pPr>
+              <w:widowControl w:val="0"/>
+              <w:autoSpaceDE w:val="0"/>
+              <w:autoSpaceDN w:val="0"/>
+              <w:adjustRightInd w:val="0"/>
+              <w:spacing w:before="0" w:line="240" w:lineRule="auto"/>
+              <w:ind w:right="-136"/>
+              <w:rPr>
+                <w:rFonts w:ascii="BRH Malayalam Extra" w:hAnsi="BRH Malayalam Extra" w:cs="BRH Malayalam Extra"/>
+                <w:sz w:val="40"/>
+                <w:szCs w:val="40"/>
+                <w:lang w:val="it-IT" w:eastAsia="en-IN"/>
+              </w:rPr>
+            </w:pPr>
+            <w:r>
+              <w:rPr>
+                <w:rFonts w:ascii="BRH Malayalam Extra" w:hAnsi="BRH Malayalam Extra" w:cs="BRH Malayalam Extra"/>
+                <w:sz w:val="40"/>
+                <w:szCs w:val="40"/>
+                <w:lang w:val="it-IT" w:eastAsia="en-IN"/>
+              </w:rPr>
+              <w:t xml:space="preserve">pxP˜I | </w:t>
+            </w:r>
+          </w:p>
+          <w:p>
+            <w:pPr>
+              <w:widowControl w:val="0"/>
+              <w:autoSpaceDE w:val="0"/>
+              <w:autoSpaceDN w:val="0"/>
+              <w:adjustRightInd w:val="0"/>
+              <w:spacing w:before="0" w:line="240" w:lineRule="auto"/>
+              <w:ind w:right="-136"/>
+              <w:rPr>
+                <w:rFonts w:ascii="BRH Malayalam Extra" w:hAnsi="BRH Malayalam Extra" w:cs="BRH Malayalam Extra"/>
+                <w:color w:val="000000"/>
+                <w:sz w:val="40"/>
+                <w:szCs w:val="40"/>
+                <w:lang w:val="it-IT" w:eastAsia="en-IN"/>
+              </w:rPr>
+            </w:pPr>
+            <w:r>
+              <w:rPr>
+                <w:rFonts w:ascii="BRH Malayalam Extra" w:hAnsi="BRH Malayalam Extra" w:cs="BRH Malayalam Extra"/>
+                <w:sz w:val="40"/>
+                <w:szCs w:val="40"/>
+                <w:lang w:val="it-IT" w:eastAsia="en-IN"/>
+              </w:rPr>
+              <w:t>öex</w:t>
+            </w:r>
+            <w:r>
+              <w:rPr>
+                <w:rFonts w:ascii="BRH Malayalam Extra" w:hAnsi="BRH Malayalam Extra" w:cs="BRH Malayalam Extra"/>
+                <w:sz w:val="32"/>
+                <w:szCs w:val="40"/>
+                <w:lang w:val="it-IT" w:eastAsia="en-IN"/>
+              </w:rPr>
+              <w:t>–</w:t>
+            </w:r>
+            <w:r>
+              <w:rPr>
+                <w:rFonts w:ascii="BRH Malayalam Extra" w:hAnsi="BRH Malayalam Extra" w:cs="BRH Malayalam Extra"/>
+                <w:sz w:val="40"/>
+                <w:szCs w:val="40"/>
+                <w:lang w:val="it-IT" w:eastAsia="en-IN"/>
+              </w:rPr>
+              <w:t xml:space="preserve">YiyZy— </w:t>
+            </w:r>
+            <w:r>
+              <w:rPr>
+                <w:rFonts w:ascii="BRH Malayalam Extra" w:hAnsi="BRH Malayalam Extra" w:cs="BRH Malayalam Extra"/>
+                <w:sz w:val="40"/>
+                <w:szCs w:val="40"/>
+                <w:highlight w:val="yellow"/>
+                <w:lang w:val="it-IT" w:eastAsia="en-IN"/>
+              </w:rPr>
+              <w:t>öex</w:t>
+            </w:r>
+            <w:r>
+              <w:rPr>
+                <w:rFonts w:ascii="BRH Malayalam Extra" w:hAnsi="BRH Malayalam Extra" w:cs="BRH Malayalam Extra"/>
+                <w:sz w:val="40"/>
+                <w:szCs w:val="40"/>
+                <w:lang w:val="it-IT" w:eastAsia="en-IN"/>
+              </w:rPr>
+              <w:t xml:space="preserve"> - A</w:t>
+            </w:r>
+            <w:r>
+              <w:rPr>
+                <w:rFonts w:ascii="BRH Malayalam Extra" w:hAnsi="BRH Malayalam Extra" w:cs="BRH Malayalam Extra"/>
+                <w:sz w:val="32"/>
+                <w:szCs w:val="40"/>
+                <w:lang w:val="it-IT" w:eastAsia="en-IN"/>
+              </w:rPr>
+              <w:t>–</w:t>
+            </w:r>
+            <w:r>
+              <w:rPr>
+                <w:rFonts w:ascii="BRH Malayalam Extra" w:hAnsi="BRH Malayalam Extra" w:cs="BRH Malayalam Extra"/>
+                <w:sz w:val="40"/>
+                <w:szCs w:val="40"/>
+                <w:lang w:val="it-IT" w:eastAsia="en-IN"/>
+              </w:rPr>
+              <w:t>dI |</w:t>
+            </w:r>
+          </w:p>
+        </w:tc>
+        <w:tc>
+          <w:tcPr>
+            <w:tcW w:w="5103" w:type="dxa"/>
+            <w:tcBorders>
+              <w:top w:val="single" w:sz="4" w:space="0" w:color="000000"/>
+              <w:left w:val="single" w:sz="4" w:space="0" w:color="000000"/>
+              <w:bottom w:val="single" w:sz="4" w:space="0" w:color="auto"/>
+              <w:right w:val="single" w:sz="4" w:space="0" w:color="000000"/>
+            </w:tcBorders>
+          </w:tcPr>
+          <w:p>
+            <w:pPr>
+              <w:widowControl w:val="0"/>
+              <w:autoSpaceDE w:val="0"/>
+              <w:autoSpaceDN w:val="0"/>
+              <w:adjustRightInd w:val="0"/>
+              <w:spacing w:before="0" w:line="240" w:lineRule="auto"/>
+              <w:ind w:right="-136"/>
+              <w:rPr>
+                <w:rFonts w:ascii="BRH Malayalam Extra" w:hAnsi="BRH Malayalam Extra" w:cs="BRH Malayalam Extra"/>
+                <w:sz w:val="40"/>
+                <w:szCs w:val="40"/>
+                <w:lang w:val="it-IT" w:eastAsia="en-IN"/>
+              </w:rPr>
+            </w:pPr>
+            <w:r>
+              <w:rPr>
+                <w:rFonts w:ascii="BRH Malayalam Extra" w:hAnsi="BRH Malayalam Extra" w:cs="BRH Malayalam Extra"/>
+                <w:sz w:val="40"/>
+                <w:szCs w:val="40"/>
+                <w:lang w:val="it-IT" w:eastAsia="en-IN"/>
+              </w:rPr>
+              <w:t xml:space="preserve">pxP˜I | </w:t>
+            </w:r>
+          </w:p>
+          <w:p>
+            <w:pPr>
+              <w:widowControl w:val="0"/>
+              <w:autoSpaceDE w:val="0"/>
+              <w:autoSpaceDN w:val="0"/>
+              <w:adjustRightInd w:val="0"/>
+              <w:spacing w:before="0" w:line="240" w:lineRule="auto"/>
+              <w:rPr>
+                <w:rFonts w:ascii="BRH Malayalam Extra" w:hAnsi="BRH Malayalam Extra" w:cs="BRH Malayalam Extra"/>
+                <w:color w:val="000000"/>
+                <w:sz w:val="40"/>
+                <w:szCs w:val="40"/>
+                <w:lang w:val="it-IT" w:eastAsia="en-IN"/>
+              </w:rPr>
+            </w:pPr>
+            <w:r>
+              <w:rPr>
+                <w:rFonts w:ascii="BRH Malayalam Extra" w:hAnsi="BRH Malayalam Extra" w:cs="BRH Malayalam Extra"/>
+                <w:sz w:val="40"/>
+                <w:szCs w:val="40"/>
+                <w:lang w:val="it-IT" w:eastAsia="en-IN"/>
+              </w:rPr>
+              <w:t>öex</w:t>
+            </w:r>
+            <w:r>
+              <w:rPr>
+                <w:rFonts w:ascii="BRH Malayalam Extra" w:hAnsi="BRH Malayalam Extra" w:cs="BRH Malayalam Extra"/>
+                <w:sz w:val="32"/>
+                <w:szCs w:val="40"/>
+                <w:lang w:val="it-IT" w:eastAsia="en-IN"/>
+              </w:rPr>
+              <w:t>–</w:t>
+            </w:r>
+            <w:r>
+              <w:rPr>
+                <w:rFonts w:ascii="BRH Malayalam Extra" w:hAnsi="BRH Malayalam Extra" w:cs="BRH Malayalam Extra"/>
+                <w:sz w:val="40"/>
+                <w:szCs w:val="40"/>
+                <w:lang w:val="it-IT" w:eastAsia="en-IN"/>
+              </w:rPr>
+              <w:t xml:space="preserve">YiyZy— </w:t>
+            </w:r>
+            <w:r>
+              <w:rPr>
+                <w:rFonts w:ascii="BRH Malayalam Extra" w:hAnsi="BRH Malayalam Extra" w:cs="BRH Malayalam Extra"/>
+                <w:sz w:val="40"/>
+                <w:szCs w:val="40"/>
+                <w:highlight w:val="green"/>
+                <w:lang w:val="it-IT" w:eastAsia="en-IN"/>
+              </w:rPr>
+              <w:t>öe</w:t>
+            </w:r>
+            <w:r>
+              <w:rPr>
+                <w:rFonts w:ascii="BRH Malayalam Extra" w:hAnsi="BRH Malayalam Extra" w:cs="BRH Malayalam Extra"/>
+                <w:sz w:val="40"/>
+                <w:szCs w:val="40"/>
+                <w:lang w:val="it-IT" w:eastAsia="en-IN"/>
+              </w:rPr>
+              <w:t xml:space="preserve"> - A</w:t>
+            </w:r>
+            <w:r>
+              <w:rPr>
+                <w:rFonts w:ascii="BRH Malayalam Extra" w:hAnsi="BRH Malayalam Extra" w:cs="BRH Malayalam Extra"/>
+                <w:sz w:val="32"/>
+                <w:szCs w:val="40"/>
+                <w:lang w:val="it-IT" w:eastAsia="en-IN"/>
+              </w:rPr>
+              <w:t>–</w:t>
+            </w:r>
+            <w:r>
+              <w:rPr>
+                <w:rFonts w:ascii="BRH Malayalam Extra" w:hAnsi="BRH Malayalam Extra" w:cs="BRH Malayalam Extra"/>
+                <w:sz w:val="40"/>
+                <w:szCs w:val="40"/>
+                <w:lang w:val="it-IT" w:eastAsia="en-IN"/>
+              </w:rPr>
+              <w:t>dI |</w:t>
             </w:r>
           </w:p>
         </w:tc>
@@ -1303,18 +934,6 @@
         </w:rPr>
         <w:t>================</w:t>
       </w:r>
-    </w:p>
-    <w:p>
-      <w:pPr>
-        <w:jc w:val="center"/>
-        <w:rPr>
-          <w:b/>
-          <w:bCs/>
-          <w:sz w:val="32"/>
-          <w:szCs w:val="32"/>
-          <w:u w:val="single"/>
-        </w:rPr>
-      </w:pPr>
     </w:p>
     <w:p>
       <w:pPr>
@@ -1841,7 +1460,6 @@
                 <w:sz w:val="32"/>
                 <w:szCs w:val="32"/>
               </w:rPr>
-              <w:lastRenderedPageBreak/>
               <w:t>Reference</w:t>
             </w:r>
           </w:p>
@@ -1864,7 +1482,6 @@
                 <w:sz w:val="32"/>
                 <w:szCs w:val="32"/>
               </w:rPr>
-              <w:lastRenderedPageBreak/>
               <w:t>As Printed</w:t>
             </w:r>
           </w:p>
@@ -3351,6 +2968,7 @@
                 <w:sz w:val="32"/>
                 <w:szCs w:val="32"/>
               </w:rPr>
+              <w:lastRenderedPageBreak/>
               <w:t>Reference</w:t>
             </w:r>
           </w:p>
@@ -3373,6 +2991,7 @@
                 <w:sz w:val="32"/>
                 <w:szCs w:val="32"/>
               </w:rPr>
+              <w:lastRenderedPageBreak/>
               <w:t>As Printed</w:t>
             </w:r>
           </w:p>
@@ -3660,7 +3279,6 @@
                 <w:sz w:val="32"/>
                 <w:szCs w:val="32"/>
               </w:rPr>
-              <w:lastRenderedPageBreak/>
               <w:t>Reference</w:t>
             </w:r>
           </w:p>
@@ -3683,7 +3301,6 @@
                 <w:sz w:val="32"/>
                 <w:szCs w:val="32"/>
               </w:rPr>
-              <w:lastRenderedPageBreak/>
               <w:t>As Printed</w:t>
             </w:r>
           </w:p>
@@ -4517,6 +4134,7 @@
                 <w:highlight w:val="yellow"/>
                 <w:lang w:val="it-IT" w:eastAsia="en-IN"/>
               </w:rPr>
+              <w:lastRenderedPageBreak/>
               <w:t>Ad¡ - b£qõ— |</w:t>
             </w:r>
           </w:p>
@@ -4552,6 +4170,7 @@
                 <w:szCs w:val="40"/>
                 <w:lang w:val="it-IT" w:eastAsia="en-IN"/>
               </w:rPr>
+              <w:lastRenderedPageBreak/>
               <w:t xml:space="preserve">czkx—sJ | </w:t>
             </w:r>
             <w:r>
@@ -4621,6 +4240,7 @@
                 <w:highlight w:val="green"/>
                 <w:lang w:val="it-IT" w:eastAsia="en-IN"/>
               </w:rPr>
+              <w:lastRenderedPageBreak/>
               <w:t>- b£qõ— |</w:t>
             </w:r>
             <w:r>
@@ -4883,7 +4503,6 @@
                 <w:sz w:val="32"/>
                 <w:szCs w:val="32"/>
               </w:rPr>
-              <w:lastRenderedPageBreak/>
               <w:t>Reference</w:t>
             </w:r>
           </w:p>
@@ -4906,7 +4525,6 @@
                 <w:sz w:val="32"/>
                 <w:szCs w:val="32"/>
               </w:rPr>
-              <w:lastRenderedPageBreak/>
               <w:t>As Printed</w:t>
             </w:r>
           </w:p>
@@ -5848,6 +5466,7 @@
                 <w:sz w:val="32"/>
                 <w:szCs w:val="32"/>
               </w:rPr>
+              <w:lastRenderedPageBreak/>
               <w:t>1.1.4.2 –</w:t>
             </w:r>
             <w:r>
@@ -6508,7 +6127,6 @@
                 <w:szCs w:val="32"/>
                 <w:lang w:val="it-IT"/>
               </w:rPr>
-              <w:lastRenderedPageBreak/>
               <w:t>1.1.4.2 – Padam</w:t>
             </w:r>
           </w:p>
@@ -8047,6 +7665,7 @@
                 <w:sz w:val="32"/>
                 <w:szCs w:val="32"/>
               </w:rPr>
+              <w:lastRenderedPageBreak/>
               <w:t>1.1.8</w:t>
             </w:r>
             <w:r>
@@ -8766,7 +8385,6 @@
                 <w:sz w:val="32"/>
                 <w:szCs w:val="32"/>
               </w:rPr>
-              <w:lastRenderedPageBreak/>
               <w:t>1.1.9.3</w:t>
             </w:r>
             <w:r>
@@ -10449,6 +10067,7 @@
                 <w:szCs w:val="32"/>
                 <w:lang w:val="it-IT"/>
               </w:rPr>
+              <w:lastRenderedPageBreak/>
               <w:t>Panchaati No. 21</w:t>
             </w:r>
           </w:p>
@@ -10485,6 +10104,7 @@
                 <w:szCs w:val="40"/>
                 <w:lang w:val="it-IT" w:eastAsia="en-IN"/>
               </w:rPr>
+              <w:lastRenderedPageBreak/>
               <w:t>h¡p—dI | A</w:t>
             </w:r>
             <w:r>
@@ -11024,7 +10644,6 @@
                 <w:szCs w:val="32"/>
                 <w:lang w:val="it-IT"/>
               </w:rPr>
-              <w:lastRenderedPageBreak/>
               <w:t>1.1.14.3 – Padam</w:t>
             </w:r>
           </w:p>
@@ -12167,6 +11786,7 @@
                 <w:sz w:val="32"/>
                 <w:szCs w:val="32"/>
               </w:rPr>
+              <w:lastRenderedPageBreak/>
               <w:t>(</w:t>
             </w:r>
             <w:r>
@@ -12238,6 +11858,7 @@
           <w:szCs w:val="32"/>
           <w:u w:val="single"/>
         </w:rPr>
+        <w:lastRenderedPageBreak/>
         <w:t>==================================</w:t>
       </w:r>
     </w:p>
@@ -12356,7 +11977,6 @@
                 <w:sz w:val="32"/>
                 <w:szCs w:val="32"/>
               </w:rPr>
-              <w:lastRenderedPageBreak/>
               <w:t>Reference</w:t>
             </w:r>
           </w:p>
@@ -12379,7 +11999,6 @@
                 <w:sz w:val="32"/>
                 <w:szCs w:val="32"/>
               </w:rPr>
-              <w:lastRenderedPageBreak/>
               <w:t>As Printed</w:t>
             </w:r>
           </w:p>
@@ -13226,6 +12845,7 @@
                 <w:szCs w:val="36"/>
                 <w:lang w:eastAsia="en-IN"/>
               </w:rPr>
+              <w:lastRenderedPageBreak/>
               <w:t>1.1.12.1 Padam</w:t>
             </w:r>
           </w:p>
@@ -13783,7 +13403,6 @@
                 <w:sz w:val="32"/>
                 <w:szCs w:val="32"/>
               </w:rPr>
-              <w:lastRenderedPageBreak/>
               <w:t>1.1.14.4-Padam</w:t>
             </w:r>
           </w:p>
@@ -14502,6 +14121,7 @@
                 <w:cs/>
                 <w:lang w:bidi="ta-IN"/>
               </w:rPr>
+              <w:lastRenderedPageBreak/>
               <w:t>1.1.1.1</w:t>
             </w:r>
             <w:r>
@@ -14849,7 +14469,6 @@
                 <w:szCs w:val="32"/>
                 <w:lang w:bidi="ta-IN"/>
               </w:rPr>
-              <w:lastRenderedPageBreak/>
               <w:t>1.1.5.2 Padam 47</w:t>
             </w:r>
           </w:p>
@@ -15738,6 +15357,7 @@
                 <w:szCs w:val="32"/>
                 <w:lang w:bidi="ta-IN"/>
               </w:rPr>
+              <w:lastRenderedPageBreak/>
               <w:t>1.1.12.1 – Padam 5</w:t>
             </w:r>
           </w:p>

</xml_diff>